<commit_message>
TS Jatai Ghanam 4.1 and 4.2 Kramam 6.5 Tamil
</commit_message>
<xml_diff>
--- a/TS Jatai Ghanam Project/TS 4.2/TS 4.2 Ghanam Tamil Corrections.docx
+++ b/TS Jatai Ghanam Project/TS 4.2/TS 4.2 Ghanam Tamil Corrections.docx
@@ -366,19 +366,6 @@
           <w:u w:val="single"/>
         </w:rPr>
       </w:pPr>
-    </w:p>
-    <w:p>
-      <w:pPr>
-        <w:spacing w:before="0" w:line="240" w:lineRule="auto"/>
-        <w:jc w:val="center"/>
-        <w:rPr>
-          <w:b/>
-          <w:bCs/>
-          <w:sz w:val="32"/>
-          <w:szCs w:val="32"/>
-          <w:u w:val="single"/>
-        </w:rPr>
-      </w:pPr>
       <w:r>
         <w:rPr>
           <w:b/>
@@ -389,7 +376,6 @@
         </w:rPr>
         <w:t xml:space="preserve">TS </w:t>
       </w:r>
-      <w:proofErr w:type="gramStart"/>
       <w:r>
         <w:rPr>
           <w:b/>
@@ -428,18 +414,7 @@
           <w:szCs w:val="32"/>
           <w:u w:val="single"/>
         </w:rPr>
-        <w:t>–</w:t>
-      </w:r>
-      <w:proofErr w:type="gramEnd"/>
-      <w:r>
-        <w:rPr>
-          <w:b/>
-          <w:bCs/>
-          <w:sz w:val="32"/>
-          <w:szCs w:val="32"/>
-          <w:u w:val="single"/>
-        </w:rPr>
-        <w:t xml:space="preserve"> TS </w:t>
+        <w:t xml:space="preserve">– TS </w:t>
       </w:r>
       <w:r>
         <w:rPr>
@@ -1527,7 +1502,6 @@
               </w:rPr>
               <w:t>)</w:t>
             </w:r>
-            <w:proofErr w:type="gramStart"/>
             <w:r>
               <w:rPr>
                 <w:rFonts w:ascii="Latha" w:hAnsi="Latha" w:cs="Latha"/>
@@ -1545,7 +1519,6 @@
               </w:rPr>
               <w:t>அனு</w:t>
             </w:r>
-            <w:proofErr w:type="gramEnd"/>
             <w:r>
               <w:rPr>
                 <w:rFonts w:ascii="BRH Tamil Tab Extra" w:hAnsi="BRH Tamil Tab Extra" w:cs="Latha"/>
@@ -2704,7 +2677,6 @@
               </w:rPr>
               <w:t>)</w:t>
             </w:r>
-            <w:proofErr w:type="gramStart"/>
             <w:r>
               <w:rPr>
                 <w:rFonts w:ascii="Latha" w:hAnsi="Latha" w:cs="Latha"/>
@@ -2722,7 +2694,6 @@
               </w:rPr>
               <w:t>அனு</w:t>
             </w:r>
-            <w:proofErr w:type="gramEnd"/>
             <w:r>
               <w:rPr>
                 <w:rFonts w:ascii="BRH Tamil Tab Extra" w:hAnsi="BRH Tamil Tab Extra" w:cs="Latha"/>
@@ -3195,7 +3166,6 @@
               </w:rPr>
               <w:t>)</w:t>
             </w:r>
-            <w:proofErr w:type="gramStart"/>
             <w:r>
               <w:rPr>
                 <w:rFonts w:ascii="Latha" w:hAnsi="Latha" w:cs="Latha"/>
@@ -3213,7 +3183,6 @@
               </w:rPr>
               <w:t>அ</w:t>
             </w:r>
-            <w:proofErr w:type="gramEnd"/>
             <w:r>
               <w:rPr>
                 <w:rFonts w:ascii="BRH Tamil Tab Extra" w:hAnsi="BRH Tamil Tab Extra" w:cs="Latha"/>
@@ -3662,7 +3631,6 @@
                 <w:szCs w:val="24"/>
                 <w:lang w:bidi="ta-IN"/>
               </w:rPr>
-              <w:lastRenderedPageBreak/>
               <w:t>(2</w:t>
             </w:r>
             <w:r>
@@ -3799,7 +3767,6 @@
               </w:rPr>
               <w:t>)</w:t>
             </w:r>
-            <w:proofErr w:type="gramStart"/>
             <w:r>
               <w:rPr>
                 <w:rFonts w:ascii="Latha" w:hAnsi="Latha" w:cs="Latha"/>
@@ -3817,7 +3784,6 @@
               </w:rPr>
               <w:t>அனு</w:t>
             </w:r>
-            <w:proofErr w:type="gramEnd"/>
             <w:r>
               <w:rPr>
                 <w:rFonts w:ascii="BRH Tamil Tab Extra" w:hAnsi="BRH Tamil Tab Extra" w:cs="Latha"/>
@@ -3927,164 +3893,151 @@
               <w:adjustRightInd w:val="0"/>
               <w:spacing w:before="0" w:line="240" w:lineRule="auto"/>
               <w:rPr>
-                <w:rFonts w:ascii="Latha" w:hAnsi="Latha" w:cs="Latha"/>
-                <w:szCs w:val="24"/>
-                <w:lang w:bidi="ta-IN"/>
-              </w:rPr>
-            </w:pPr>
-            <w:r>
-              <w:rPr>
-                <w:rFonts w:ascii="Latha" w:hAnsi="Latha" w:cs="Latha"/>
-                <w:szCs w:val="24"/>
-                <w:cs/>
-                <w:lang w:bidi="ta-IN"/>
-              </w:rPr>
-              <w:t>அ</w:t>
-            </w:r>
-            <w:r>
-              <w:rPr>
-                <w:rFonts w:ascii="Latha" w:hAnsi="Latha" w:cs="Latha"/>
-                <w:szCs w:val="24"/>
-                <w:highlight w:val="yellow"/>
-                <w:cs/>
-                <w:lang w:bidi="ta-IN"/>
-              </w:rPr>
-              <w:t>னு</w:t>
-            </w:r>
-            <w:r>
-              <w:rPr>
-                <w:rFonts w:ascii="Latha" w:hAnsi="Latha" w:cs="Latha"/>
-                <w:szCs w:val="24"/>
-                <w:cs/>
-                <w:lang w:bidi="ta-IN"/>
-              </w:rPr>
-              <w:t xml:space="preserve"> வி வ்யன் வ</w:t>
-            </w:r>
-            <w:r>
-              <w:rPr>
-                <w:rFonts w:ascii="Latha" w:hAnsi="Latha" w:cs="Latha"/>
-                <w:szCs w:val="24"/>
-                <w:highlight w:val="yellow"/>
-                <w:cs/>
-                <w:lang w:bidi="ta-IN"/>
-              </w:rPr>
-              <w:t>னு</w:t>
-            </w:r>
-            <w:r>
-              <w:rPr>
-                <w:rFonts w:ascii="Latha" w:hAnsi="Latha" w:cs="Latha"/>
-                <w:szCs w:val="24"/>
-                <w:cs/>
-                <w:lang w:bidi="ta-IN"/>
-              </w:rPr>
-              <w:t xml:space="preserve"> வி க்ர</w:t>
-            </w:r>
-            <w:r>
-              <w:rPr>
-                <w:rFonts w:ascii="BRH Tamil Tab Extra" w:hAnsi="BRH Tamil Tab Extra" w:cs="Latha"/>
-                <w:b/>
-                <w:bCs/>
-                <w:szCs w:val="28"/>
-                <w:lang w:bidi="ta-IN"/>
-              </w:rPr>
-              <w:t>†</w:t>
-            </w:r>
-            <w:r>
-              <w:rPr>
-                <w:rFonts w:ascii="Latha" w:hAnsi="Latha" w:cs="Latha"/>
-                <w:szCs w:val="24"/>
-                <w:cs/>
-                <w:lang w:bidi="ta-IN"/>
-              </w:rPr>
-              <w:t>மஸ்வ க்ரமஸ்வ</w:t>
-            </w:r>
-            <w:r>
-              <w:rPr>
-                <w:rFonts w:ascii="BRH Tamil Tab Extra" w:hAnsi="BRH Tamil Tab Extra" w:cs="Latha"/>
-                <w:b/>
-                <w:bCs/>
-                <w:szCs w:val="28"/>
-                <w:lang w:bidi="ta-IN"/>
-              </w:rPr>
-              <w:t>…</w:t>
-            </w:r>
-            <w:r>
-              <w:rPr>
-                <w:rFonts w:ascii="Latha" w:hAnsi="Latha" w:cs="Latha"/>
-                <w:szCs w:val="24"/>
-                <w:lang w:bidi="ta-IN"/>
-              </w:rPr>
-              <w:t xml:space="preserve"> </w:t>
-            </w:r>
-            <w:r>
-              <w:rPr>
-                <w:rFonts w:ascii="Latha" w:hAnsi="Latha" w:cs="Latha"/>
-                <w:szCs w:val="24"/>
-                <w:cs/>
-                <w:lang w:bidi="ta-IN"/>
-              </w:rPr>
-              <w:t>வ்யன் வ</w:t>
-            </w:r>
-            <w:r>
-              <w:rPr>
-                <w:rFonts w:ascii="Latha" w:hAnsi="Latha" w:cs="Latha"/>
-                <w:szCs w:val="24"/>
-                <w:highlight w:val="yellow"/>
-                <w:cs/>
-                <w:lang w:bidi="ta-IN"/>
-              </w:rPr>
-              <w:t>னு</w:t>
-            </w:r>
-            <w:r>
-              <w:rPr>
-                <w:rFonts w:ascii="Latha" w:hAnsi="Latha" w:cs="Latha"/>
-                <w:szCs w:val="24"/>
-                <w:cs/>
-                <w:lang w:bidi="ta-IN"/>
-              </w:rPr>
-              <w:t xml:space="preserve"> வி க்ர</w:t>
-            </w:r>
-            <w:r>
-              <w:rPr>
-                <w:rFonts w:ascii="BRH Tamil Tab Extra" w:hAnsi="BRH Tamil Tab Extra" w:cs="Latha"/>
-                <w:b/>
-                <w:bCs/>
-                <w:szCs w:val="28"/>
-                <w:lang w:bidi="ta-IN"/>
-              </w:rPr>
-              <w:t>†</w:t>
-            </w:r>
-            <w:r>
-              <w:rPr>
-                <w:rFonts w:ascii="Latha" w:hAnsi="Latha" w:cs="Latha"/>
-                <w:szCs w:val="24"/>
-                <w:cs/>
-                <w:lang w:bidi="ta-IN"/>
-              </w:rPr>
-              <w:t xml:space="preserve">மஸ்வ </w:t>
-            </w:r>
-            <w:r>
-              <w:rPr>
-                <w:rFonts w:ascii="Latha" w:hAnsi="Latha" w:cs="Latha"/>
-                <w:szCs w:val="24"/>
-                <w:lang w:bidi="ta-IN"/>
-              </w:rPr>
-              <w:t>|</w:t>
-            </w:r>
-          </w:p>
-          <w:p>
-            <w:pPr>
-              <w:widowControl w:val="0"/>
-              <w:autoSpaceDE w:val="0"/>
-              <w:autoSpaceDN w:val="0"/>
-              <w:adjustRightInd w:val="0"/>
-              <w:spacing w:before="0" w:line="240" w:lineRule="auto"/>
-              <w:rPr>
                 <w:rFonts w:cs="BRH Malayalam Extra"/>
                 <w:color w:val="FF0000"/>
                 <w:szCs w:val="40"/>
               </w:rPr>
             </w:pPr>
+            <w:r>
+              <w:rPr>
+                <w:rFonts w:ascii="Latha" w:hAnsi="Latha" w:cs="Latha"/>
+                <w:szCs w:val="24"/>
+                <w:cs/>
+                <w:lang w:bidi="ta-IN"/>
+              </w:rPr>
+              <w:lastRenderedPageBreak/>
+              <w:t>அ</w:t>
+            </w:r>
+            <w:r>
+              <w:rPr>
+                <w:rFonts w:ascii="Latha" w:hAnsi="Latha" w:cs="Latha"/>
+                <w:szCs w:val="24"/>
+                <w:highlight w:val="yellow"/>
+                <w:cs/>
+                <w:lang w:bidi="ta-IN"/>
+              </w:rPr>
+              <w:t>னு</w:t>
+            </w:r>
+            <w:r>
+              <w:rPr>
+                <w:rFonts w:ascii="Latha" w:hAnsi="Latha" w:cs="Latha"/>
+                <w:szCs w:val="24"/>
+                <w:cs/>
+                <w:lang w:bidi="ta-IN"/>
+              </w:rPr>
+              <w:t xml:space="preserve"> வி வ்யன் வ</w:t>
+            </w:r>
+            <w:r>
+              <w:rPr>
+                <w:rFonts w:ascii="Latha" w:hAnsi="Latha" w:cs="Latha"/>
+                <w:szCs w:val="24"/>
+                <w:highlight w:val="yellow"/>
+                <w:cs/>
+                <w:lang w:bidi="ta-IN"/>
+              </w:rPr>
+              <w:t>னு</w:t>
+            </w:r>
+            <w:r>
+              <w:rPr>
+                <w:rFonts w:ascii="Latha" w:hAnsi="Latha" w:cs="Latha"/>
+                <w:szCs w:val="24"/>
+                <w:cs/>
+                <w:lang w:bidi="ta-IN"/>
+              </w:rPr>
+              <w:t xml:space="preserve"> வி க்ர</w:t>
+            </w:r>
+            <w:r>
+              <w:rPr>
+                <w:rFonts w:ascii="BRH Tamil Tab Extra" w:hAnsi="BRH Tamil Tab Extra" w:cs="Latha"/>
+                <w:b/>
+                <w:bCs/>
+                <w:szCs w:val="28"/>
+                <w:lang w:bidi="ta-IN"/>
+              </w:rPr>
+              <w:t>†</w:t>
+            </w:r>
+            <w:r>
+              <w:rPr>
+                <w:rFonts w:ascii="Latha" w:hAnsi="Latha" w:cs="Latha"/>
+                <w:szCs w:val="24"/>
+                <w:cs/>
+                <w:lang w:bidi="ta-IN"/>
+              </w:rPr>
+              <w:t>மஸ்வ க்ரமஸ்வ</w:t>
+            </w:r>
+            <w:r>
+              <w:rPr>
+                <w:rFonts w:ascii="BRH Tamil Tab Extra" w:hAnsi="BRH Tamil Tab Extra" w:cs="Latha"/>
+                <w:b/>
+                <w:bCs/>
+                <w:szCs w:val="28"/>
+                <w:lang w:bidi="ta-IN"/>
+              </w:rPr>
+              <w:t>…</w:t>
+            </w:r>
+            <w:r>
+              <w:rPr>
+                <w:rFonts w:ascii="Latha" w:hAnsi="Latha" w:cs="Latha"/>
+                <w:szCs w:val="24"/>
+                <w:lang w:bidi="ta-IN"/>
+              </w:rPr>
+              <w:t xml:space="preserve"> </w:t>
+            </w:r>
+            <w:r>
+              <w:rPr>
+                <w:rFonts w:ascii="Latha" w:hAnsi="Latha" w:cs="Latha"/>
+                <w:szCs w:val="24"/>
+                <w:cs/>
+                <w:lang w:bidi="ta-IN"/>
+              </w:rPr>
+              <w:t>வ்யன் வ</w:t>
+            </w:r>
+            <w:r>
+              <w:rPr>
+                <w:rFonts w:ascii="Latha" w:hAnsi="Latha" w:cs="Latha"/>
+                <w:szCs w:val="24"/>
+                <w:highlight w:val="yellow"/>
+                <w:cs/>
+                <w:lang w:bidi="ta-IN"/>
+              </w:rPr>
+              <w:t>னு</w:t>
+            </w:r>
+            <w:r>
+              <w:rPr>
+                <w:rFonts w:ascii="Latha" w:hAnsi="Latha" w:cs="Latha"/>
+                <w:szCs w:val="24"/>
+                <w:cs/>
+                <w:lang w:bidi="ta-IN"/>
+              </w:rPr>
+              <w:t xml:space="preserve"> வி க்ர</w:t>
+            </w:r>
+            <w:r>
+              <w:rPr>
+                <w:rFonts w:ascii="BRH Tamil Tab Extra" w:hAnsi="BRH Tamil Tab Extra" w:cs="Latha"/>
+                <w:b/>
+                <w:bCs/>
+                <w:szCs w:val="28"/>
+                <w:lang w:bidi="ta-IN"/>
+              </w:rPr>
+              <w:t>†</w:t>
+            </w:r>
+            <w:r>
+              <w:rPr>
+                <w:rFonts w:ascii="Latha" w:hAnsi="Latha" w:cs="Latha"/>
+                <w:szCs w:val="24"/>
+                <w:cs/>
+                <w:lang w:bidi="ta-IN"/>
+              </w:rPr>
+              <w:t xml:space="preserve">மஸ்வ </w:t>
+            </w:r>
+            <w:r>
+              <w:rPr>
+                <w:rFonts w:ascii="Latha" w:hAnsi="Latha" w:cs="Latha"/>
+                <w:szCs w:val="24"/>
+                <w:lang w:bidi="ta-IN"/>
+              </w:rPr>
+              <w:t>|</w:t>
+            </w:r>
           </w:p>
         </w:tc>
         <w:tc>
@@ -4253,7 +4206,6 @@
               </w:rPr>
               <w:t>)</w:t>
             </w:r>
-            <w:proofErr w:type="gramStart"/>
             <w:r>
               <w:rPr>
                 <w:rFonts w:ascii="Latha" w:hAnsi="Latha" w:cs="Latha"/>
@@ -4271,7 +4223,6 @@
               </w:rPr>
               <w:t>அ</w:t>
             </w:r>
-            <w:proofErr w:type="gramEnd"/>
             <w:r>
               <w:rPr>
                 <w:rFonts w:ascii="BRH Tamil Tab Extra" w:hAnsi="BRH Tamil Tab Extra" w:cs="Latha"/>
@@ -4878,7 +4829,6 @@
               </w:rPr>
               <w:t>)</w:t>
             </w:r>
-            <w:proofErr w:type="gramStart"/>
             <w:r>
               <w:rPr>
                 <w:rFonts w:ascii="Latha" w:hAnsi="Latha" w:cs="Latha"/>
@@ -4896,7 +4846,6 @@
               </w:rPr>
               <w:t>அனு</w:t>
             </w:r>
-            <w:proofErr w:type="gramEnd"/>
             <w:r>
               <w:rPr>
                 <w:rFonts w:ascii="BRH Tamil Tab Extra" w:hAnsi="BRH Tamil Tab Extra" w:cs="Latha"/>
@@ -5006,197 +4955,183 @@
               <w:adjustRightInd w:val="0"/>
               <w:spacing w:before="0" w:line="240" w:lineRule="auto"/>
               <w:rPr>
-                <w:rFonts w:ascii="Latha" w:hAnsi="Latha" w:cs="Latha"/>
-                <w:szCs w:val="24"/>
-                <w:lang w:bidi="ta-IN"/>
-              </w:rPr>
-            </w:pPr>
-            <w:r>
-              <w:rPr>
-                <w:rFonts w:ascii="Latha" w:hAnsi="Latha" w:cs="Latha"/>
-                <w:szCs w:val="24"/>
-                <w:cs/>
-                <w:lang w:bidi="ta-IN"/>
-              </w:rPr>
-              <w:lastRenderedPageBreak/>
-              <w:t>அ</w:t>
-            </w:r>
-            <w:r>
-              <w:rPr>
-                <w:rFonts w:ascii="Latha" w:hAnsi="Latha" w:cs="Latha"/>
-                <w:szCs w:val="24"/>
-                <w:highlight w:val="green"/>
-                <w:cs/>
-                <w:lang w:bidi="ta-IN"/>
-              </w:rPr>
-              <w:t>னு</w:t>
-            </w:r>
-            <w:r>
-              <w:rPr>
-                <w:rFonts w:ascii="BRH Tamil Tab Extra" w:hAnsi="BRH Tamil Tab Extra" w:cs="Latha"/>
-                <w:b/>
-                <w:bCs/>
-                <w:szCs w:val="28"/>
-                <w:lang w:bidi="ta-IN"/>
-              </w:rPr>
-              <w:t>…</w:t>
-            </w:r>
-            <w:r>
-              <w:rPr>
-                <w:rFonts w:ascii="Latha" w:hAnsi="Latha" w:cs="Latha"/>
-                <w:szCs w:val="24"/>
-                <w:cs/>
-                <w:lang w:bidi="ta-IN"/>
-              </w:rPr>
-              <w:t xml:space="preserve"> வி வ்யன் வ</w:t>
-            </w:r>
-            <w:r>
-              <w:rPr>
-                <w:rFonts w:ascii="Latha" w:hAnsi="Latha" w:cs="Latha"/>
-                <w:szCs w:val="24"/>
-                <w:highlight w:val="green"/>
-                <w:cs/>
-                <w:lang w:bidi="ta-IN"/>
-              </w:rPr>
-              <w:t>னு</w:t>
-            </w:r>
-            <w:r>
-              <w:rPr>
-                <w:rFonts w:ascii="BRH Tamil Tab Extra" w:hAnsi="BRH Tamil Tab Extra" w:cs="Latha"/>
-                <w:b/>
-                <w:bCs/>
-                <w:szCs w:val="28"/>
-                <w:highlight w:val="green"/>
-                <w:lang w:bidi="ta-IN"/>
-              </w:rPr>
-              <w:t>…</w:t>
-            </w:r>
-            <w:r>
-              <w:rPr>
-                <w:rFonts w:ascii="Latha" w:hAnsi="Latha" w:cs="Latha"/>
-                <w:szCs w:val="24"/>
-                <w:cs/>
-                <w:lang w:bidi="ta-IN"/>
-              </w:rPr>
-              <w:t xml:space="preserve"> வி க்ர</w:t>
-            </w:r>
-            <w:r>
-              <w:rPr>
-                <w:rFonts w:ascii="BRH Tamil Tab Extra" w:hAnsi="BRH Tamil Tab Extra" w:cs="Latha"/>
-                <w:b/>
-                <w:bCs/>
-                <w:szCs w:val="28"/>
-                <w:lang w:bidi="ta-IN"/>
-              </w:rPr>
-              <w:t>†</w:t>
-            </w:r>
-            <w:r>
-              <w:rPr>
-                <w:rFonts w:ascii="Latha" w:hAnsi="Latha" w:cs="Latha"/>
-                <w:szCs w:val="24"/>
-                <w:cs/>
-                <w:lang w:bidi="ta-IN"/>
-              </w:rPr>
-              <w:t>மஸ்வ க்ரமஸ்வ</w:t>
-            </w:r>
-            <w:r>
-              <w:rPr>
-                <w:rFonts w:ascii="BRH Tamil Tab Extra" w:hAnsi="BRH Tamil Tab Extra" w:cs="Latha"/>
-                <w:b/>
-                <w:bCs/>
-                <w:szCs w:val="28"/>
-                <w:lang w:bidi="ta-IN"/>
-              </w:rPr>
-              <w:t>…</w:t>
-            </w:r>
-            <w:r>
-              <w:rPr>
-                <w:rFonts w:ascii="Latha" w:hAnsi="Latha" w:cs="Latha"/>
-                <w:szCs w:val="24"/>
-                <w:lang w:bidi="ta-IN"/>
-              </w:rPr>
-              <w:t xml:space="preserve"> </w:t>
-            </w:r>
-            <w:r>
-              <w:rPr>
-                <w:rFonts w:ascii="Latha" w:hAnsi="Latha" w:cs="Latha"/>
-                <w:szCs w:val="24"/>
-                <w:cs/>
-                <w:lang w:bidi="ta-IN"/>
-              </w:rPr>
-              <w:t>வ்யன் வ</w:t>
-            </w:r>
-            <w:r>
-              <w:rPr>
-                <w:rFonts w:ascii="Latha" w:hAnsi="Latha" w:cs="Latha"/>
-                <w:szCs w:val="24"/>
-                <w:highlight w:val="green"/>
-                <w:cs/>
-                <w:lang w:bidi="ta-IN"/>
-              </w:rPr>
-              <w:t>னு</w:t>
-            </w:r>
-            <w:r>
-              <w:rPr>
-                <w:rFonts w:ascii="BRH Tamil Tab Extra" w:hAnsi="BRH Tamil Tab Extra" w:cs="Latha"/>
-                <w:b/>
-                <w:bCs/>
-                <w:szCs w:val="28"/>
-                <w:lang w:bidi="ta-IN"/>
-              </w:rPr>
-              <w:t>…</w:t>
-            </w:r>
-            <w:r>
-              <w:rPr>
-                <w:rFonts w:ascii="Latha" w:hAnsi="Latha" w:cs="Latha"/>
-                <w:szCs w:val="24"/>
-                <w:cs/>
-                <w:lang w:bidi="ta-IN"/>
-              </w:rPr>
-              <w:t xml:space="preserve"> வி க்ர</w:t>
-            </w:r>
-            <w:r>
-              <w:rPr>
-                <w:rFonts w:ascii="BRH Tamil Tab Extra" w:hAnsi="BRH Tamil Tab Extra" w:cs="Latha"/>
-                <w:b/>
-                <w:bCs/>
-                <w:szCs w:val="28"/>
-                <w:lang w:bidi="ta-IN"/>
-              </w:rPr>
-              <w:t>†</w:t>
-            </w:r>
-            <w:r>
-              <w:rPr>
-                <w:rFonts w:ascii="Latha" w:hAnsi="Latha" w:cs="Latha"/>
-                <w:szCs w:val="24"/>
-                <w:cs/>
-                <w:lang w:bidi="ta-IN"/>
-              </w:rPr>
-              <w:t xml:space="preserve">மஸ்வ </w:t>
-            </w:r>
-            <w:r>
-              <w:rPr>
-                <w:rFonts w:ascii="Latha" w:hAnsi="Latha" w:cs="Latha"/>
-                <w:szCs w:val="24"/>
-                <w:lang w:bidi="ta-IN"/>
-              </w:rPr>
-              <w:t>|</w:t>
-            </w:r>
-          </w:p>
-          <w:p>
-            <w:pPr>
-              <w:widowControl w:val="0"/>
-              <w:autoSpaceDE w:val="0"/>
-              <w:autoSpaceDN w:val="0"/>
-              <w:adjustRightInd w:val="0"/>
-              <w:spacing w:before="0" w:line="240" w:lineRule="auto"/>
-              <w:rPr>
                 <w:rFonts w:ascii="BRH Devanagari Extra" w:hAnsi="BRH Devanagari Extra" w:cs="BRH Devanagari Extra"/>
                 <w:color w:val="000000"/>
                 <w:sz w:val="32"/>
                 <w:szCs w:val="32"/>
               </w:rPr>
             </w:pPr>
+            <w:r>
+              <w:rPr>
+                <w:rFonts w:ascii="Latha" w:hAnsi="Latha" w:cs="Latha"/>
+                <w:szCs w:val="24"/>
+                <w:cs/>
+                <w:lang w:bidi="ta-IN"/>
+              </w:rPr>
+              <w:lastRenderedPageBreak/>
+              <w:t>அ</w:t>
+            </w:r>
+            <w:r>
+              <w:rPr>
+                <w:rFonts w:ascii="Latha" w:hAnsi="Latha" w:cs="Latha"/>
+                <w:szCs w:val="24"/>
+                <w:highlight w:val="green"/>
+                <w:cs/>
+                <w:lang w:bidi="ta-IN"/>
+              </w:rPr>
+              <w:t>னு</w:t>
+            </w:r>
+            <w:r>
+              <w:rPr>
+                <w:rFonts w:ascii="BRH Tamil Tab Extra" w:hAnsi="BRH Tamil Tab Extra" w:cs="Latha"/>
+                <w:b/>
+                <w:bCs/>
+                <w:szCs w:val="28"/>
+                <w:lang w:bidi="ta-IN"/>
+              </w:rPr>
+              <w:t>…</w:t>
+            </w:r>
+            <w:r>
+              <w:rPr>
+                <w:rFonts w:ascii="Latha" w:hAnsi="Latha" w:cs="Latha"/>
+                <w:szCs w:val="24"/>
+                <w:cs/>
+                <w:lang w:bidi="ta-IN"/>
+              </w:rPr>
+              <w:t xml:space="preserve"> வி வ்யன் வ</w:t>
+            </w:r>
+            <w:r>
+              <w:rPr>
+                <w:rFonts w:ascii="Latha" w:hAnsi="Latha" w:cs="Latha"/>
+                <w:szCs w:val="24"/>
+                <w:highlight w:val="green"/>
+                <w:cs/>
+                <w:lang w:bidi="ta-IN"/>
+              </w:rPr>
+              <w:t>னு</w:t>
+            </w:r>
+            <w:r>
+              <w:rPr>
+                <w:rFonts w:ascii="BRH Tamil Tab Extra" w:hAnsi="BRH Tamil Tab Extra" w:cs="Latha"/>
+                <w:b/>
+                <w:bCs/>
+                <w:szCs w:val="28"/>
+                <w:highlight w:val="green"/>
+                <w:lang w:bidi="ta-IN"/>
+              </w:rPr>
+              <w:t>…</w:t>
+            </w:r>
+            <w:r>
+              <w:rPr>
+                <w:rFonts w:ascii="Latha" w:hAnsi="Latha" w:cs="Latha"/>
+                <w:szCs w:val="24"/>
+                <w:cs/>
+                <w:lang w:bidi="ta-IN"/>
+              </w:rPr>
+              <w:t xml:space="preserve"> வி க்ர</w:t>
+            </w:r>
+            <w:r>
+              <w:rPr>
+                <w:rFonts w:ascii="BRH Tamil Tab Extra" w:hAnsi="BRH Tamil Tab Extra" w:cs="Latha"/>
+                <w:b/>
+                <w:bCs/>
+                <w:szCs w:val="28"/>
+                <w:lang w:bidi="ta-IN"/>
+              </w:rPr>
+              <w:t>†</w:t>
+            </w:r>
+            <w:r>
+              <w:rPr>
+                <w:rFonts w:ascii="Latha" w:hAnsi="Latha" w:cs="Latha"/>
+                <w:szCs w:val="24"/>
+                <w:cs/>
+                <w:lang w:bidi="ta-IN"/>
+              </w:rPr>
+              <w:t>மஸ்வ க்ரமஸ்வ</w:t>
+            </w:r>
+            <w:r>
+              <w:rPr>
+                <w:rFonts w:ascii="BRH Tamil Tab Extra" w:hAnsi="BRH Tamil Tab Extra" w:cs="Latha"/>
+                <w:b/>
+                <w:bCs/>
+                <w:szCs w:val="28"/>
+                <w:lang w:bidi="ta-IN"/>
+              </w:rPr>
+              <w:t>…</w:t>
+            </w:r>
+            <w:r>
+              <w:rPr>
+                <w:rFonts w:ascii="Latha" w:hAnsi="Latha" w:cs="Latha"/>
+                <w:szCs w:val="24"/>
+                <w:lang w:bidi="ta-IN"/>
+              </w:rPr>
+              <w:t xml:space="preserve"> </w:t>
+            </w:r>
+            <w:r>
+              <w:rPr>
+                <w:rFonts w:ascii="Latha" w:hAnsi="Latha" w:cs="Latha"/>
+                <w:szCs w:val="24"/>
+                <w:cs/>
+                <w:lang w:bidi="ta-IN"/>
+              </w:rPr>
+              <w:t>வ்யன் வ</w:t>
+            </w:r>
+            <w:r>
+              <w:rPr>
+                <w:rFonts w:ascii="Latha" w:hAnsi="Latha" w:cs="Latha"/>
+                <w:szCs w:val="24"/>
+                <w:highlight w:val="green"/>
+                <w:cs/>
+                <w:lang w:bidi="ta-IN"/>
+              </w:rPr>
+              <w:t>னு</w:t>
+            </w:r>
+            <w:r>
+              <w:rPr>
+                <w:rFonts w:ascii="BRH Tamil Tab Extra" w:hAnsi="BRH Tamil Tab Extra" w:cs="Latha"/>
+                <w:b/>
+                <w:bCs/>
+                <w:szCs w:val="28"/>
+                <w:lang w:bidi="ta-IN"/>
+              </w:rPr>
+              <w:t>…</w:t>
+            </w:r>
+            <w:r>
+              <w:rPr>
+                <w:rFonts w:ascii="Latha" w:hAnsi="Latha" w:cs="Latha"/>
+                <w:szCs w:val="24"/>
+                <w:cs/>
+                <w:lang w:bidi="ta-IN"/>
+              </w:rPr>
+              <w:t xml:space="preserve"> வி க்ர</w:t>
+            </w:r>
+            <w:r>
+              <w:rPr>
+                <w:rFonts w:ascii="BRH Tamil Tab Extra" w:hAnsi="BRH Tamil Tab Extra" w:cs="Latha"/>
+                <w:b/>
+                <w:bCs/>
+                <w:szCs w:val="28"/>
+                <w:lang w:bidi="ta-IN"/>
+              </w:rPr>
+              <w:t>†</w:t>
+            </w:r>
+            <w:r>
+              <w:rPr>
+                <w:rFonts w:ascii="Latha" w:hAnsi="Latha" w:cs="Latha"/>
+                <w:szCs w:val="24"/>
+                <w:cs/>
+                <w:lang w:bidi="ta-IN"/>
+              </w:rPr>
+              <w:t xml:space="preserve">மஸ்வ </w:t>
+            </w:r>
+            <w:r>
+              <w:rPr>
+                <w:rFonts w:ascii="Latha" w:hAnsi="Latha" w:cs="Latha"/>
+                <w:szCs w:val="24"/>
+                <w:lang w:bidi="ta-IN"/>
+              </w:rPr>
+              <w:t>|</w:t>
+            </w:r>
           </w:p>
           <w:p>
             <w:pPr>
@@ -5374,7 +5309,6 @@
               </w:rPr>
               <w:t>2)</w:t>
             </w:r>
-            <w:proofErr w:type="gramStart"/>
             <w:r>
               <w:rPr>
                 <w:rFonts w:ascii="Latha" w:hAnsi="Latha" w:cs="Latha"/>
@@ -5392,7 +5326,6 @@
               </w:rPr>
               <w:t>தி</w:t>
             </w:r>
-            <w:proofErr w:type="gramEnd"/>
             <w:r>
               <w:rPr>
                 <w:rFonts w:ascii="Latha" w:hAnsi="Latha" w:cs="Latha"/>
@@ -5976,7 +5909,6 @@
               </w:rPr>
               <w:t>3)</w:t>
             </w:r>
-            <w:proofErr w:type="gramStart"/>
             <w:r>
               <w:rPr>
                 <w:rFonts w:ascii="Latha" w:hAnsi="Latha" w:cs="Latha"/>
@@ -5994,7 +5926,6 @@
               </w:rPr>
               <w:t>அனு</w:t>
             </w:r>
-            <w:proofErr w:type="gramEnd"/>
             <w:r>
               <w:rPr>
                 <w:rFonts w:ascii="BRH Tamil Tab Extra" w:hAnsi="BRH Tamil Tab Extra" w:cs="Latha"/>
@@ -6405,7 +6336,6 @@
               </w:rPr>
               <w:t>2)</w:t>
             </w:r>
-            <w:proofErr w:type="gramStart"/>
             <w:r>
               <w:rPr>
                 <w:rFonts w:ascii="Latha" w:hAnsi="Latha" w:cs="Latha"/>
@@ -6423,7 +6353,6 @@
               </w:rPr>
               <w:t>தி</w:t>
             </w:r>
-            <w:proofErr w:type="gramEnd"/>
             <w:r>
               <w:rPr>
                 <w:rFonts w:ascii="Latha" w:hAnsi="Latha" w:cs="Latha"/>
@@ -7027,7 +6956,6 @@
               </w:rPr>
               <w:t>3)</w:t>
             </w:r>
-            <w:proofErr w:type="gramStart"/>
             <w:r>
               <w:rPr>
                 <w:rFonts w:ascii="Latha" w:hAnsi="Latha" w:cs="Latha"/>
@@ -7045,7 +6973,6 @@
               </w:rPr>
               <w:t>அனு</w:t>
             </w:r>
-            <w:proofErr w:type="gramEnd"/>
             <w:r>
               <w:rPr>
                 <w:rFonts w:ascii="BRH Tamil Tab Extra" w:hAnsi="BRH Tamil Tab Extra" w:cs="Latha"/>
@@ -7484,7 +7411,6 @@
               </w:rPr>
               <w:t>)</w:t>
             </w:r>
-            <w:proofErr w:type="gramStart"/>
             <w:r>
               <w:rPr>
                 <w:rFonts w:ascii="Latha" w:hAnsi="Latha" w:cs="Latha"/>
@@ -7502,7 +7428,6 @@
               </w:rPr>
               <w:t>தி</w:t>
             </w:r>
-            <w:proofErr w:type="gramEnd"/>
             <w:r>
               <w:rPr>
                 <w:rFonts w:ascii="Latha" w:hAnsi="Latha" w:cs="Latha"/>
@@ -8060,7 +7985,6 @@
               </w:rPr>
               <w:t>)</w:t>
             </w:r>
-            <w:proofErr w:type="gramStart"/>
             <w:r>
               <w:rPr>
                 <w:rFonts w:ascii="Latha" w:hAnsi="Latha" w:cs="Latha"/>
@@ -8078,7 +8002,6 @@
               </w:rPr>
               <w:t>அனு</w:t>
             </w:r>
-            <w:proofErr w:type="gramEnd"/>
             <w:r>
               <w:rPr>
                 <w:rFonts w:ascii="BRH Tamil Tab Extra" w:hAnsi="BRH Tamil Tab Extra" w:cs="Latha"/>
@@ -8379,7 +8302,6 @@
                 <w:szCs w:val="24"/>
                 <w:lang w:bidi="ta-IN"/>
               </w:rPr>
-              <w:lastRenderedPageBreak/>
               <w:t>(</w:t>
             </w:r>
             <w:r>
@@ -8474,7 +8396,6 @@
               </w:rPr>
               <w:t>)</w:t>
             </w:r>
-            <w:proofErr w:type="gramStart"/>
             <w:r>
               <w:rPr>
                 <w:rFonts w:ascii="Latha" w:hAnsi="Latha" w:cs="Latha"/>
@@ -8492,7 +8413,6 @@
               </w:rPr>
               <w:t>தி</w:t>
             </w:r>
-            <w:proofErr w:type="gramEnd"/>
             <w:r>
               <w:rPr>
                 <w:rFonts w:ascii="Latha" w:hAnsi="Latha" w:cs="Latha"/>
@@ -9072,7 +8992,6 @@
               </w:rPr>
               <w:t>)</w:t>
             </w:r>
-            <w:proofErr w:type="gramStart"/>
             <w:r>
               <w:rPr>
                 <w:rFonts w:ascii="Latha" w:hAnsi="Latha" w:cs="Latha"/>
@@ -9090,7 +9009,6 @@
               </w:rPr>
               <w:t>அனு</w:t>
             </w:r>
-            <w:proofErr w:type="gramEnd"/>
             <w:r>
               <w:rPr>
                 <w:rFonts w:ascii="BRH Tamil Tab Extra" w:hAnsi="BRH Tamil Tab Extra" w:cs="Latha"/>
@@ -9524,7 +9442,6 @@
               </w:rPr>
               <w:t>)</w:t>
             </w:r>
-            <w:proofErr w:type="gramStart"/>
             <w:r>
               <w:rPr>
                 <w:rFonts w:ascii="Latha" w:hAnsi="Latha" w:cs="Latha"/>
@@ -9542,7 +9459,6 @@
               </w:rPr>
               <w:t>த்வா</w:t>
             </w:r>
-            <w:proofErr w:type="gramEnd"/>
             <w:r>
               <w:rPr>
                 <w:rFonts w:ascii="BRH Tamil Tab Extra" w:hAnsi="BRH Tamil Tab Extra" w:cs="Latha"/>
@@ -10893,7 +10809,6 @@
               </w:rPr>
               <w:t>3)</w:t>
             </w:r>
-            <w:proofErr w:type="gramStart"/>
             <w:r>
               <w:rPr>
                 <w:rFonts w:ascii="Latha" w:hAnsi="Latha" w:cs="Latha"/>
@@ -10911,7 +10826,6 @@
               </w:rPr>
               <w:t>வா</w:t>
             </w:r>
-            <w:proofErr w:type="gramEnd"/>
             <w:r>
               <w:rPr>
                 <w:rFonts w:ascii="BRH Tamil Tab Extra" w:hAnsi="BRH Tamil Tab Extra" w:cs="Latha"/>
@@ -11714,7 +11628,6 @@
               </w:rPr>
               <w:t>)</w:t>
             </w:r>
-            <w:proofErr w:type="gramStart"/>
             <w:r>
               <w:rPr>
                 <w:rFonts w:ascii="Latha" w:hAnsi="Latha" w:cs="Latha"/>
@@ -11732,7 +11645,6 @@
               </w:rPr>
               <w:t>த்வா</w:t>
             </w:r>
-            <w:proofErr w:type="gramEnd"/>
             <w:r>
               <w:rPr>
                 <w:rFonts w:ascii="BRH Tamil Tab Extra" w:hAnsi="BRH Tamil Tab Extra" w:cs="Latha"/>
@@ -16103,7 +16015,6 @@
               </w:rPr>
               <w:t>4)</w:t>
             </w:r>
-            <w:proofErr w:type="gramStart"/>
             <w:r>
               <w:rPr>
                 <w:rFonts w:ascii="Latha" w:hAnsi="Latha" w:cs="Latha"/>
@@ -16121,7 +16032,6 @@
               </w:rPr>
               <w:t>அ</w:t>
             </w:r>
-            <w:proofErr w:type="gramEnd"/>
             <w:r>
               <w:rPr>
                 <w:rFonts w:ascii="BRH Tamil Tab Extra" w:hAnsi="BRH Tamil Tab Extra" w:cs="Latha"/>
@@ -16700,7 +16610,6 @@
               </w:rPr>
               <w:t>4)</w:t>
             </w:r>
-            <w:proofErr w:type="gramStart"/>
             <w:r>
               <w:rPr>
                 <w:rFonts w:ascii="Latha" w:hAnsi="Latha" w:cs="Latha"/>
@@ -16718,7 +16627,6 @@
               </w:rPr>
               <w:t>அ</w:t>
             </w:r>
-            <w:proofErr w:type="gramEnd"/>
             <w:r>
               <w:rPr>
                 <w:rFonts w:ascii="BRH Tamil Tab Extra" w:hAnsi="BRH Tamil Tab Extra" w:cs="Latha"/>
@@ -17333,7 +17241,6 @@
               </w:rPr>
               <w:t>)</w:t>
             </w:r>
-            <w:proofErr w:type="gramStart"/>
             <w:r>
               <w:rPr>
                 <w:rFonts w:ascii="Latha" w:hAnsi="Latha" w:cs="Latha"/>
@@ -17351,7 +17258,6 @@
               </w:rPr>
               <w:t>ஆ</w:t>
             </w:r>
-            <w:proofErr w:type="gramEnd"/>
             <w:r>
               <w:rPr>
                 <w:rFonts w:ascii="BRH Tamil Tab Extra" w:hAnsi="BRH Tamil Tab Extra" w:cs="Latha"/>
@@ -17812,7 +17718,6 @@
               </w:rPr>
               <w:t>)</w:t>
             </w:r>
-            <w:proofErr w:type="gramStart"/>
             <w:r>
               <w:rPr>
                 <w:rFonts w:ascii="Latha" w:hAnsi="Latha" w:cs="Latha"/>
@@ -17830,7 +17735,6 @@
               </w:rPr>
               <w:t>வ</w:t>
             </w:r>
-            <w:proofErr w:type="gramEnd"/>
             <w:r>
               <w:rPr>
                 <w:rFonts w:ascii="BRH Tamil Tab Extra" w:hAnsi="BRH Tamil Tab Extra" w:cs="Latha"/>
@@ -18504,7 +18408,6 @@
               </w:rPr>
               <w:t>)</w:t>
             </w:r>
-            <w:proofErr w:type="gramStart"/>
             <w:r>
               <w:rPr>
                 <w:rFonts w:ascii="Latha" w:hAnsi="Latha" w:cs="Latha"/>
@@ -18522,7 +18425,6 @@
               </w:rPr>
               <w:t>ஆ</w:t>
             </w:r>
-            <w:proofErr w:type="gramEnd"/>
             <w:r>
               <w:rPr>
                 <w:rFonts w:ascii="BRH Tamil Tab Extra" w:hAnsi="BRH Tamil Tab Extra" w:cs="Latha"/>
@@ -19011,7 +18913,6 @@
               </w:rPr>
               <w:t>)</w:t>
             </w:r>
-            <w:proofErr w:type="gramStart"/>
             <w:r>
               <w:rPr>
                 <w:rFonts w:ascii="Latha" w:hAnsi="Latha" w:cs="Latha"/>
@@ -19029,7 +18930,6 @@
               </w:rPr>
               <w:t>வ</w:t>
             </w:r>
-            <w:proofErr w:type="gramEnd"/>
             <w:r>
               <w:rPr>
                 <w:rFonts w:ascii="BRH Tamil Tab Extra" w:hAnsi="BRH Tamil Tab Extra" w:cs="Latha"/>
@@ -21712,7 +21612,6 @@
               </w:rPr>
               <w:t>)</w:t>
             </w:r>
-            <w:proofErr w:type="gramStart"/>
             <w:r>
               <w:rPr>
                 <w:rFonts w:ascii="Latha" w:hAnsi="Latha" w:cs="Latha"/>
@@ -21730,7 +21629,6 @@
               </w:rPr>
               <w:t>உ</w:t>
             </w:r>
-            <w:proofErr w:type="gramEnd"/>
             <w:r>
               <w:rPr>
                 <w:rFonts w:ascii="BRH Tamil Tab Extra" w:hAnsi="BRH Tamil Tab Extra" w:cs="Latha"/>
@@ -22351,7 +22249,6 @@
               </w:rPr>
               <w:t>)</w:t>
             </w:r>
-            <w:proofErr w:type="gramStart"/>
             <w:r>
               <w:rPr>
                 <w:rFonts w:ascii="Latha" w:hAnsi="Latha" w:cs="Latha"/>
@@ -22369,7 +22266,6 @@
               </w:rPr>
               <w:t>உ</w:t>
             </w:r>
-            <w:proofErr w:type="gramEnd"/>
             <w:r>
               <w:rPr>
                 <w:rFonts w:ascii="BRH Tamil Tab Extra" w:hAnsi="BRH Tamil Tab Extra" w:cs="Latha"/>
@@ -24748,7 +24644,6 @@
               </w:rPr>
               <w:t>)</w:t>
             </w:r>
-            <w:proofErr w:type="gramStart"/>
             <w:r>
               <w:rPr>
                 <w:rFonts w:ascii="Latha" w:hAnsi="Latha" w:cs="Latha"/>
@@ -24766,7 +24661,6 @@
               </w:rPr>
               <w:t>உ</w:t>
             </w:r>
-            <w:proofErr w:type="gramEnd"/>
             <w:r>
               <w:rPr>
                 <w:rFonts w:ascii="BRH Tamil Tab Extra" w:hAnsi="BRH Tamil Tab Extra" w:cs="Latha"/>
@@ -25402,7 +25296,6 @@
               </w:rPr>
               <w:t>)</w:t>
             </w:r>
-            <w:proofErr w:type="gramStart"/>
             <w:r>
               <w:rPr>
                 <w:rFonts w:ascii="Latha" w:hAnsi="Latha" w:cs="Latha"/>
@@ -25420,7 +25313,6 @@
               </w:rPr>
               <w:t>உ</w:t>
             </w:r>
-            <w:proofErr w:type="gramEnd"/>
             <w:r>
               <w:rPr>
                 <w:rFonts w:ascii="BRH Tamil Tab Extra" w:hAnsi="BRH Tamil Tab Extra" w:cs="Latha"/>
@@ -25865,7 +25757,6 @@
               </w:rPr>
               <w:t>)</w:t>
             </w:r>
-            <w:proofErr w:type="gramStart"/>
             <w:r>
               <w:rPr>
                 <w:rFonts w:ascii="Latha" w:hAnsi="Latha" w:cs="Latha"/>
@@ -25883,7 +25774,6 @@
               </w:rPr>
               <w:t>ஓஷ</w:t>
             </w:r>
-            <w:proofErr w:type="gramEnd"/>
             <w:r>
               <w:rPr>
                 <w:rFonts w:ascii="BRH Tamil Tab Extra" w:hAnsi="BRH Tamil Tab Extra" w:cs="Latha"/>
@@ -26622,7 +26512,6 @@
               </w:rPr>
               <w:t>)</w:t>
             </w:r>
-            <w:proofErr w:type="gramStart"/>
             <w:r>
               <w:rPr>
                 <w:rFonts w:ascii="Latha" w:hAnsi="Latha" w:cs="Latha"/>
@@ -26640,7 +26529,6 @@
               </w:rPr>
               <w:t>அ</w:t>
             </w:r>
-            <w:proofErr w:type="gramEnd"/>
             <w:r>
               <w:rPr>
                 <w:rFonts w:ascii="BRH Tamil Tab Extra" w:hAnsi="BRH Tamil Tab Extra" w:cs="Latha"/>
@@ -27286,7 +27174,6 @@
               </w:rPr>
               <w:t>)</w:t>
             </w:r>
-            <w:proofErr w:type="gramStart"/>
             <w:r>
               <w:rPr>
                 <w:rFonts w:ascii="Latha" w:hAnsi="Latha" w:cs="Latha"/>
@@ -27304,7 +27191,6 @@
               </w:rPr>
               <w:t>ஓஷ</w:t>
             </w:r>
-            <w:proofErr w:type="gramEnd"/>
             <w:r>
               <w:rPr>
                 <w:rFonts w:ascii="BRH Tamil Tab Extra" w:hAnsi="BRH Tamil Tab Extra" w:cs="Latha"/>
@@ -28093,7 +27979,6 @@
               </w:rPr>
               <w:t>)</w:t>
             </w:r>
-            <w:proofErr w:type="gramStart"/>
             <w:r>
               <w:rPr>
                 <w:rFonts w:ascii="Latha" w:hAnsi="Latha" w:cs="Latha"/>
@@ -28111,7 +27996,6 @@
               </w:rPr>
               <w:t>அ</w:t>
             </w:r>
-            <w:proofErr w:type="gramEnd"/>
             <w:r>
               <w:rPr>
                 <w:rFonts w:ascii="BRH Tamil Tab Extra" w:hAnsi="BRH Tamil Tab Extra" w:cs="Latha"/>
@@ -28783,7 +28667,6 @@
               </w:rPr>
               <w:t>)</w:t>
             </w:r>
-            <w:proofErr w:type="gramStart"/>
             <w:r>
               <w:rPr>
                 <w:rFonts w:ascii="Latha" w:hAnsi="Latha" w:cs="Latha"/>
@@ -28801,7 +28684,6 @@
               </w:rPr>
               <w:t>தி</w:t>
             </w:r>
-            <w:proofErr w:type="gramEnd"/>
             <w:r>
               <w:rPr>
                 <w:rFonts w:ascii="BRH Tamil Tab Extra" w:hAnsi="BRH Tamil Tab Extra" w:cs="Latha"/>
@@ -29160,7 +29042,6 @@
               </w:rPr>
               <w:t>)</w:t>
             </w:r>
-            <w:proofErr w:type="gramStart"/>
             <w:r>
               <w:rPr>
                 <w:rFonts w:ascii="Latha" w:hAnsi="Latha" w:cs="Latha"/>
@@ -29178,7 +29059,6 @@
               </w:rPr>
               <w:t>தி</w:t>
             </w:r>
-            <w:proofErr w:type="gramEnd"/>
             <w:r>
               <w:rPr>
                 <w:rFonts w:ascii="BRH Tamil Tab Extra" w:hAnsi="BRH Tamil Tab Extra" w:cs="Latha"/>
@@ -29540,7 +29420,6 @@
               </w:rPr>
               <w:t>)</w:t>
             </w:r>
-            <w:proofErr w:type="gramStart"/>
             <w:r>
               <w:rPr>
                 <w:rFonts w:ascii="Latha" w:hAnsi="Latha" w:cs="Latha"/>
@@ -29558,7 +29437,6 @@
               </w:rPr>
               <w:t>அ</w:t>
             </w:r>
-            <w:proofErr w:type="gramEnd"/>
             <w:r>
               <w:rPr>
                 <w:rFonts w:ascii="BRH Tamil Tab Extra" w:hAnsi="BRH Tamil Tab Extra" w:cs="Latha"/>
@@ -29823,7 +29701,6 @@
               </w:rPr>
               <w:t>)</w:t>
             </w:r>
-            <w:proofErr w:type="gramStart"/>
             <w:r>
               <w:rPr>
                 <w:rFonts w:ascii="Latha" w:hAnsi="Latha" w:cs="Latha"/>
@@ -29841,7 +29718,6 @@
               </w:rPr>
               <w:t>அ</w:t>
             </w:r>
-            <w:proofErr w:type="gramEnd"/>
             <w:r>
               <w:rPr>
                 <w:rFonts w:ascii="BRH Tamil Tab Extra" w:hAnsi="BRH Tamil Tab Extra" w:cs="Latha"/>
@@ -30110,7 +29986,6 @@
               </w:rPr>
               <w:t>2)</w:t>
             </w:r>
-            <w:proofErr w:type="gramStart"/>
             <w:r>
               <w:rPr>
                 <w:rFonts w:ascii="Latha" w:hAnsi="Latha" w:cs="Latha"/>
@@ -30128,7 +30003,6 @@
               </w:rPr>
               <w:t>அத</w:t>
             </w:r>
-            <w:proofErr w:type="gramEnd"/>
             <w:r>
               <w:rPr>
                 <w:rFonts w:ascii="BRH Tamil Tab Extra" w:hAnsi="BRH Tamil Tab Extra" w:cs="Latha"/>
@@ -30966,7 +30840,6 @@
               </w:rPr>
               <w:t>3)</w:t>
             </w:r>
-            <w:proofErr w:type="gramStart"/>
             <w:r>
               <w:rPr>
                 <w:rFonts w:ascii="Latha" w:hAnsi="Latha" w:cs="Latha"/>
@@ -30984,7 +30857,6 @@
               </w:rPr>
               <w:t>ஶ</w:t>
             </w:r>
-            <w:proofErr w:type="gramEnd"/>
             <w:r>
               <w:rPr>
                 <w:rFonts w:ascii="BRH Tamil Tab Extra" w:hAnsi="BRH Tamil Tab Extra" w:cs="Latha"/>
@@ -31912,7 +31784,6 @@
               </w:rPr>
               <w:t>3)</w:t>
             </w:r>
-            <w:proofErr w:type="gramStart"/>
             <w:r>
               <w:rPr>
                 <w:rFonts w:ascii="Latha" w:hAnsi="Latha" w:cs="Latha"/>
@@ -31930,7 +31801,6 @@
               </w:rPr>
               <w:t>ஶ</w:t>
             </w:r>
-            <w:proofErr w:type="gramEnd"/>
             <w:r>
               <w:rPr>
                 <w:rFonts w:ascii="BRH Tamil Tab Extra" w:hAnsi="BRH Tamil Tab Extra" w:cs="Latha"/>
@@ -32408,7 +32278,6 @@
               </w:rPr>
               <w:t>2)</w:t>
             </w:r>
-            <w:proofErr w:type="gramStart"/>
             <w:r>
               <w:rPr>
                 <w:rFonts w:ascii="Latha" w:hAnsi="Latha" w:cs="Latha"/>
@@ -32426,7 +32295,6 @@
               </w:rPr>
               <w:t>அத</w:t>
             </w:r>
-            <w:proofErr w:type="gramEnd"/>
             <w:r>
               <w:rPr>
                 <w:rFonts w:ascii="BRH Tamil Tab Extra" w:hAnsi="BRH Tamil Tab Extra" w:cs="Latha"/>
@@ -33210,7 +33078,6 @@
               </w:rPr>
               <w:t>3)</w:t>
             </w:r>
-            <w:proofErr w:type="gramStart"/>
             <w:r>
               <w:rPr>
                 <w:rFonts w:ascii="Latha" w:hAnsi="Latha" w:cs="Latha"/>
@@ -33228,7 +33095,6 @@
               </w:rPr>
               <w:t>ஶ</w:t>
             </w:r>
-            <w:proofErr w:type="gramEnd"/>
             <w:r>
               <w:rPr>
                 <w:rFonts w:ascii="BRH Tamil Tab Extra" w:hAnsi="BRH Tamil Tab Extra" w:cs="Latha"/>
@@ -34130,7 +33996,6 @@
               </w:rPr>
               <w:t>3)</w:t>
             </w:r>
-            <w:proofErr w:type="gramStart"/>
             <w:r>
               <w:rPr>
                 <w:rFonts w:ascii="Latha" w:hAnsi="Latha" w:cs="Latha"/>
@@ -34148,7 +34013,6 @@
               </w:rPr>
               <w:t>ஶ</w:t>
             </w:r>
-            <w:proofErr w:type="gramEnd"/>
             <w:r>
               <w:rPr>
                 <w:rFonts w:ascii="BRH Tamil Tab Extra" w:hAnsi="BRH Tamil Tab Extra" w:cs="Latha"/>
@@ -34623,7 +34487,6 @@
               </w:rPr>
               <w:t>2)</w:t>
             </w:r>
-            <w:proofErr w:type="gramStart"/>
             <w:r>
               <w:rPr>
                 <w:rFonts w:ascii="Latha" w:hAnsi="Latha" w:cs="Latha"/>
@@ -34641,7 +34504,6 @@
               </w:rPr>
               <w:t>அ</w:t>
             </w:r>
-            <w:proofErr w:type="gramEnd"/>
             <w:r>
               <w:rPr>
                 <w:rFonts w:ascii="BRH Tamil Tab Extra" w:hAnsi="BRH Tamil Tab Extra" w:cs="Latha"/>
@@ -35874,7 +35736,6 @@
               </w:rPr>
               <w:t>2)</w:t>
             </w:r>
-            <w:proofErr w:type="gramStart"/>
             <w:r>
               <w:rPr>
                 <w:rFonts w:ascii="Latha" w:hAnsi="Latha" w:cs="Latha"/>
@@ -35892,7 +35753,6 @@
               </w:rPr>
               <w:t>அ</w:t>
             </w:r>
-            <w:proofErr w:type="gramEnd"/>
             <w:r>
               <w:rPr>
                 <w:rFonts w:ascii="BRH Tamil Tab Extra" w:hAnsi="BRH Tamil Tab Extra" w:cs="Latha"/>
@@ -36332,7 +36192,6 @@
               </w:rPr>
               <w:t>2)</w:t>
             </w:r>
-            <w:proofErr w:type="gramStart"/>
             <w:r>
               <w:rPr>
                 <w:rFonts w:ascii="Latha" w:hAnsi="Latha" w:cs="Latha"/>
@@ -36350,7 +36209,6 @@
               </w:rPr>
               <w:t>அ</w:t>
             </w:r>
-            <w:proofErr w:type="gramEnd"/>
             <w:r>
               <w:rPr>
                 <w:rFonts w:ascii="BRH Tamil Tab Extra" w:hAnsi="BRH Tamil Tab Extra" w:cs="Latha"/>
@@ -37494,7 +37352,6 @@
               </w:rPr>
               <w:t>2)</w:t>
             </w:r>
-            <w:proofErr w:type="gramStart"/>
             <w:r>
               <w:rPr>
                 <w:rFonts w:ascii="Latha" w:hAnsi="Latha" w:cs="Latha"/>
@@ -37512,7 +37369,6 @@
               </w:rPr>
               <w:t>அ</w:t>
             </w:r>
-            <w:proofErr w:type="gramEnd"/>
             <w:r>
               <w:rPr>
                 <w:rFonts w:ascii="BRH Tamil Tab Extra" w:hAnsi="BRH Tamil Tab Extra" w:cs="Latha"/>
@@ -37946,7 +37802,6 @@
               </w:rPr>
               <w:t>)</w:t>
             </w:r>
-            <w:proofErr w:type="gramStart"/>
             <w:r>
               <w:rPr>
                 <w:rFonts w:ascii="Latha" w:hAnsi="Latha" w:cs="Latha"/>
@@ -37964,7 +37819,6 @@
               </w:rPr>
               <w:t>பா</w:t>
             </w:r>
-            <w:proofErr w:type="gramEnd"/>
             <w:r>
               <w:rPr>
                 <w:rFonts w:ascii="BRH Tamil Tab Extra" w:hAnsi="BRH Tamil Tab Extra" w:cs="Latha"/>
@@ -38292,7 +38146,6 @@
               </w:rPr>
               <w:t>)</w:t>
             </w:r>
-            <w:proofErr w:type="gramStart"/>
             <w:r>
               <w:rPr>
                 <w:rFonts w:ascii="Latha" w:hAnsi="Latha" w:cs="Latha"/>
@@ -38310,7 +38163,6 @@
               </w:rPr>
               <w:t>பா</w:t>
             </w:r>
-            <w:proofErr w:type="gramEnd"/>
             <w:r>
               <w:rPr>
                 <w:rFonts w:ascii="BRH Tamil Tab Extra" w:hAnsi="BRH Tamil Tab Extra" w:cs="Latha"/>
@@ -38654,7 +38506,6 @@
               </w:rPr>
               <w:t>)</w:t>
             </w:r>
-            <w:proofErr w:type="gramStart"/>
             <w:r>
               <w:rPr>
                 <w:rFonts w:ascii="Latha" w:hAnsi="Latha" w:cs="Latha"/>
@@ -38672,7 +38523,6 @@
               </w:rPr>
               <w:t>ப்ரா</w:t>
             </w:r>
-            <w:proofErr w:type="gramEnd"/>
             <w:r>
               <w:rPr>
                 <w:rFonts w:ascii="BRH Tamil Tab Extra" w:hAnsi="BRH Tamil Tab Extra" w:cs="Latha"/>
@@ -39010,7 +38860,6 @@
               </w:rPr>
               <w:t>)</w:t>
             </w:r>
-            <w:proofErr w:type="gramStart"/>
             <w:r>
               <w:rPr>
                 <w:rFonts w:ascii="Latha" w:hAnsi="Latha" w:cs="Latha"/>
@@ -39028,7 +38877,6 @@
               </w:rPr>
               <w:t>ப்ரா</w:t>
             </w:r>
-            <w:proofErr w:type="gramEnd"/>
             <w:r>
               <w:rPr>
                 <w:rFonts w:ascii="BRH Tamil Tab Extra" w:hAnsi="BRH Tamil Tab Extra" w:cs="Latha"/>
@@ -39385,7 +39233,6 @@
               </w:rPr>
               <w:t>)</w:t>
             </w:r>
-            <w:proofErr w:type="gramStart"/>
             <w:r>
               <w:rPr>
                 <w:rFonts w:ascii="Latha" w:hAnsi="Latha" w:cs="Latha"/>
@@ -39403,7 +39250,6 @@
               </w:rPr>
               <w:t>ஸஹு</w:t>
             </w:r>
-            <w:proofErr w:type="gramEnd"/>
             <w:r>
               <w:rPr>
                 <w:rFonts w:ascii="BRH Tamil Tab Extra" w:hAnsi="BRH Tamil Tab Extra" w:cs="Latha"/>
@@ -40125,7 +39971,6 @@
               </w:rPr>
               <w:t>)</w:t>
             </w:r>
-            <w:proofErr w:type="gramStart"/>
             <w:r>
               <w:rPr>
                 <w:rFonts w:ascii="Latha" w:hAnsi="Latha" w:cs="Latha"/>
@@ -40141,17 +39986,7 @@
                 <w:cs/>
                 <w:lang w:bidi="ta-IN"/>
               </w:rPr>
-              <w:t>ப்ர</w:t>
-            </w:r>
-            <w:proofErr w:type="gramEnd"/>
-            <w:r>
-              <w:rPr>
-                <w:rFonts w:ascii="Latha" w:hAnsi="Latha" w:cs="Latha"/>
-                <w:szCs w:val="24"/>
-                <w:cs/>
-                <w:lang w:bidi="ta-IN"/>
-              </w:rPr>
-              <w:t xml:space="preserve"> </w:t>
+              <w:t xml:space="preserve">ப்ர </w:t>
             </w:r>
             <w:r>
               <w:rPr>
@@ -40189,7 +40024,6 @@
               </w:rPr>
               <w:t>ர்</w:t>
             </w:r>
-            <w:proofErr w:type="gramStart"/>
             <w:r>
               <w:rPr>
                 <w:rFonts w:ascii="BRH Tamil Tab Extra" w:hAnsi="BRH Tamil Tab Extra" w:cs="Latha"/>
@@ -40219,7 +40053,6 @@
               </w:rPr>
               <w:t>ஷ</w:t>
             </w:r>
-            <w:proofErr w:type="gramEnd"/>
             <w:r>
               <w:rPr>
                 <w:rFonts w:ascii="BRH Tamil Tab Extra" w:hAnsi="BRH Tamil Tab Extra" w:cs="Latha"/>
@@ -41167,7 +41000,6 @@
               </w:rPr>
               <w:t>)</w:t>
             </w:r>
-            <w:proofErr w:type="gramStart"/>
             <w:r>
               <w:rPr>
                 <w:rFonts w:ascii="Latha" w:hAnsi="Latha" w:cs="Latha"/>
@@ -41185,7 +41017,6 @@
               </w:rPr>
               <w:t>ச</w:t>
             </w:r>
-            <w:proofErr w:type="gramEnd"/>
             <w:r>
               <w:rPr>
                 <w:rFonts w:ascii="BRH Tamil Tab Extra" w:hAnsi="BRH Tamil Tab Extra" w:cs="Latha"/>
@@ -41205,7 +41036,6 @@
               </w:rPr>
               <w:t>ர்</w:t>
             </w:r>
-            <w:proofErr w:type="gramStart"/>
             <w:r>
               <w:rPr>
                 <w:rFonts w:ascii="BRH Tamil Tab Extra" w:hAnsi="BRH Tamil Tab Extra" w:cs="Latha"/>
@@ -41235,7 +41065,6 @@
               </w:rPr>
               <w:t>ஷ</w:t>
             </w:r>
-            <w:proofErr w:type="gramEnd"/>
             <w:r>
               <w:rPr>
                 <w:rFonts w:ascii="BRH Tamil Tab Extra" w:hAnsi="BRH Tamil Tab Extra" w:cs="Latha"/>
@@ -42408,7 +42237,6 @@
               </w:rPr>
               <w:t>)</w:t>
             </w:r>
-            <w:proofErr w:type="gramStart"/>
             <w:r>
               <w:rPr>
                 <w:rFonts w:ascii="Latha" w:hAnsi="Latha" w:cs="Latha"/>
@@ -42426,7 +42254,6 @@
               </w:rPr>
               <w:t>ச</w:t>
             </w:r>
-            <w:proofErr w:type="gramEnd"/>
             <w:r>
               <w:rPr>
                 <w:rFonts w:ascii="BRH Tamil Tab Extra" w:hAnsi="BRH Tamil Tab Extra" w:cs="Latha"/>
@@ -42446,7 +42273,6 @@
               </w:rPr>
               <w:t>ர்</w:t>
             </w:r>
-            <w:proofErr w:type="gramStart"/>
             <w:r>
               <w:rPr>
                 <w:rFonts w:ascii="BRH Tamil Tab Extra" w:hAnsi="BRH Tamil Tab Extra" w:cs="Latha"/>
@@ -42476,7 +42302,6 @@
               </w:rPr>
               <w:t>ஷ</w:t>
             </w:r>
-            <w:proofErr w:type="gramEnd"/>
             <w:r>
               <w:rPr>
                 <w:rFonts w:ascii="BRH Tamil Tab Extra" w:hAnsi="BRH Tamil Tab Extra" w:cs="Latha"/>
@@ -43043,7 +42868,6 @@
               </w:rPr>
               <w:t>)</w:t>
             </w:r>
-            <w:proofErr w:type="gramStart"/>
             <w:r>
               <w:rPr>
                 <w:rFonts w:ascii="Latha" w:hAnsi="Latha" w:cs="Latha"/>
@@ -43059,17 +42883,7 @@
                 <w:cs/>
                 <w:lang w:bidi="ta-IN"/>
               </w:rPr>
-              <w:t>ப்ர</w:t>
-            </w:r>
-            <w:proofErr w:type="gramEnd"/>
-            <w:r>
-              <w:rPr>
-                <w:rFonts w:ascii="Latha" w:hAnsi="Latha" w:cs="Latha"/>
-                <w:szCs w:val="24"/>
-                <w:cs/>
-                <w:lang w:bidi="ta-IN"/>
-              </w:rPr>
-              <w:t xml:space="preserve"> </w:t>
+              <w:t xml:space="preserve">ப்ர </w:t>
             </w:r>
             <w:r>
               <w:rPr>
@@ -43107,7 +42921,6 @@
               </w:rPr>
               <w:t>ர்</w:t>
             </w:r>
-            <w:proofErr w:type="gramStart"/>
             <w:r>
               <w:rPr>
                 <w:rFonts w:ascii="BRH Tamil Tab Extra" w:hAnsi="BRH Tamil Tab Extra" w:cs="Latha"/>
@@ -43137,7 +42950,6 @@
               </w:rPr>
               <w:t>ஷ</w:t>
             </w:r>
-            <w:proofErr w:type="gramEnd"/>
             <w:r>
               <w:rPr>
                 <w:rFonts w:ascii="BRH Tamil Tab Extra" w:hAnsi="BRH Tamil Tab Extra" w:cs="Latha"/>
@@ -44136,7 +43948,6 @@
               </w:rPr>
               <w:t>)</w:t>
             </w:r>
-            <w:proofErr w:type="gramStart"/>
             <w:r>
               <w:rPr>
                 <w:rFonts w:ascii="Latha" w:hAnsi="Latha" w:cs="Latha"/>
@@ -44154,7 +43965,6 @@
               </w:rPr>
               <w:t>ச</w:t>
             </w:r>
-            <w:proofErr w:type="gramEnd"/>
             <w:r>
               <w:rPr>
                 <w:rFonts w:ascii="BRH Tamil Tab Extra" w:hAnsi="BRH Tamil Tab Extra" w:cs="Latha"/>
@@ -44174,7 +43984,6 @@
               </w:rPr>
               <w:t>ர்</w:t>
             </w:r>
-            <w:proofErr w:type="gramStart"/>
             <w:r>
               <w:rPr>
                 <w:rFonts w:ascii="BRH Tamil Tab Extra" w:hAnsi="BRH Tamil Tab Extra" w:cs="Latha"/>
@@ -44204,7 +44013,6 @@
               </w:rPr>
               <w:t>ஷ</w:t>
             </w:r>
-            <w:proofErr w:type="gramEnd"/>
             <w:r>
               <w:rPr>
                 <w:rFonts w:ascii="BRH Tamil Tab Extra" w:hAnsi="BRH Tamil Tab Extra" w:cs="Latha"/>
@@ -45391,7 +45199,6 @@
               </w:rPr>
               <w:t>)</w:t>
             </w:r>
-            <w:proofErr w:type="gramStart"/>
             <w:r>
               <w:rPr>
                 <w:rFonts w:ascii="Latha" w:hAnsi="Latha" w:cs="Latha"/>
@@ -45409,7 +45216,6 @@
               </w:rPr>
               <w:t>ச</w:t>
             </w:r>
-            <w:proofErr w:type="gramEnd"/>
             <w:r>
               <w:rPr>
                 <w:rFonts w:ascii="BRH Tamil Tab Extra" w:hAnsi="BRH Tamil Tab Extra" w:cs="Latha"/>
@@ -45429,7 +45235,6 @@
               </w:rPr>
               <w:t>ர்</w:t>
             </w:r>
-            <w:proofErr w:type="gramStart"/>
             <w:r>
               <w:rPr>
                 <w:rFonts w:ascii="BRH Tamil Tab Extra" w:hAnsi="BRH Tamil Tab Extra" w:cs="Latha"/>
@@ -45459,7 +45264,6 @@
               </w:rPr>
               <w:t>ஷ</w:t>
             </w:r>
-            <w:proofErr w:type="gramEnd"/>
             <w:r>
               <w:rPr>
                 <w:rFonts w:ascii="BRH Tamil Tab Extra" w:hAnsi="BRH Tamil Tab Extra" w:cs="Latha"/>
@@ -45998,7 +45802,6 @@
               </w:rPr>
               <w:t>4)</w:t>
             </w:r>
-            <w:proofErr w:type="gramStart"/>
             <w:r>
               <w:rPr>
                 <w:rFonts w:ascii="Latha" w:hAnsi="Latha" w:cs="Latha"/>
@@ -46016,7 +45819,6 @@
               </w:rPr>
               <w:t>பு</w:t>
             </w:r>
-            <w:proofErr w:type="gramEnd"/>
             <w:r>
               <w:rPr>
                 <w:rFonts w:ascii="BRH Tamil Tab Extra" w:hAnsi="BRH Tamil Tab Extra" w:cs="Latha"/>
@@ -47014,7 +46816,6 @@
               </w:rPr>
               <w:t>)</w:t>
             </w:r>
-            <w:proofErr w:type="gramStart"/>
             <w:r>
               <w:rPr>
                 <w:rFonts w:ascii="Latha" w:hAnsi="Latha" w:cs="Latha"/>
@@ -47032,7 +46833,6 @@
               </w:rPr>
               <w:t>ஊ</w:t>
             </w:r>
-            <w:proofErr w:type="gramEnd"/>
             <w:r>
               <w:rPr>
                 <w:rFonts w:ascii="BRH Tamil Tab Extra" w:hAnsi="BRH Tamil Tab Extra" w:cs="Latha"/>
@@ -48119,7 +47919,6 @@
               </w:rPr>
               <w:t>4)</w:t>
             </w:r>
-            <w:proofErr w:type="gramStart"/>
             <w:r>
               <w:rPr>
                 <w:rFonts w:ascii="Latha" w:hAnsi="Latha" w:cs="Latha"/>
@@ -48137,7 +47936,6 @@
               </w:rPr>
               <w:t>பு</w:t>
             </w:r>
-            <w:proofErr w:type="gramEnd"/>
             <w:r>
               <w:rPr>
                 <w:rFonts w:ascii="BRH Tamil Tab Extra" w:hAnsi="BRH Tamil Tab Extra" w:cs="Latha"/>
@@ -49160,7 +48958,6 @@
               </w:rPr>
               <w:t>)</w:t>
             </w:r>
-            <w:proofErr w:type="gramStart"/>
             <w:r>
               <w:rPr>
                 <w:rFonts w:ascii="Latha" w:hAnsi="Latha" w:cs="Latha"/>
@@ -49178,7 +48975,6 @@
               </w:rPr>
               <w:t>ஊ</w:t>
             </w:r>
-            <w:proofErr w:type="gramEnd"/>
             <w:r>
               <w:rPr>
                 <w:rFonts w:ascii="BRH Tamil Tab Extra" w:hAnsi="BRH Tamil Tab Extra" w:cs="Latha"/>

</xml_diff>